<commit_message>
docs: actualizar enlace al repositorio de GitHub en el informe APF2 (Word y PDF)
</commit_message>
<xml_diff>
--- a/APF2_Informe_Pruebas_CamShop.docx
+++ b/APF2_Informe_Pruebas_CamShop.docx
@@ -13536,41 +13536,41 @@
                 <w:sz w:val="19"/>
                 <w:szCs w:val="19"/>
               </w:rPr>
+              <w:t xml:space="preserve">URL: https://github.com/MartinJGP/camshop-qa-automation</w:t>
+            </w:r>
+          </w:p>
+          <w:p>
+            <w:pPr>
+              <w:spacing w:after="50" w:line="240"/>
+              <w:jc w:val="left"/>
+            </w:pPr>
+            <w:r>
+              <w:rPr>
+                <w:rFonts w:ascii="Calibri" w:cs="Calibri" w:eastAsia="Calibri" w:hAnsi="Calibri"/>
+                <w:b w:val="false"/>
+                <w:bCs w:val="false"/>
+                <w:color w:val="1E293B"/>
+                <w:sz w:val="19"/>
+                <w:szCs w:val="19"/>
+              </w:rPr>
               <w:t xml:space="preserve">Directorio: /qa-automation/</w:t>
             </w:r>
           </w:p>
           <w:p>
             <w:pPr>
-              <w:spacing w:after="50" w:line="240"/>
-              <w:jc w:val="left"/>
-            </w:pPr>
-            <w:r>
-              <w:rPr>
-                <w:rFonts w:ascii="Calibri" w:cs="Calibri" w:eastAsia="Calibri" w:hAnsi="Calibri"/>
-                <w:b w:val="false"/>
-                <w:bCs w:val="false"/>
-                <w:color w:val="1E293B"/>
-                <w:sz w:val="19"/>
-                <w:szCs w:val="19"/>
-              </w:rPr>
-              <w:t xml:space="preserve">Suite: CompraEndToEndTest.java</w:t>
-            </w:r>
-          </w:p>
-          <w:p>
-            <w:pPr>
-              <w:spacing w:after="0" w:line="240"/>
-              <w:jc w:val="left"/>
-            </w:pPr>
-            <w:r>
-              <w:rPr>
-                <w:rFonts w:ascii="Calibri" w:cs="Calibri" w:eastAsia="Calibri" w:hAnsi="Calibri"/>
-                <w:b w:val="false"/>
-                <w:bCs w:val="false"/>
-                <w:color w:val="1E293B"/>
-                <w:sz w:val="19"/>
-                <w:szCs w:val="19"/>
-              </w:rPr>
-              <w:t xml:space="preserve">Framework: Selenium WebDriver + POM</w:t>
+              <w:spacing w:after="0" w:line="240"/>
+              <w:jc w:val="left"/>
+            </w:pPr>
+            <w:r>
+              <w:rPr>
+                <w:rFonts w:ascii="Calibri" w:cs="Calibri" w:eastAsia="Calibri" w:hAnsi="Calibri"/>
+                <w:b w:val="false"/>
+                <w:bCs w:val="false"/>
+                <w:color w:val="1E293B"/>
+                <w:sz w:val="19"/>
+                <w:szCs w:val="19"/>
+              </w:rPr>
+              <w:t xml:space="preserve">Suite: CompraEndToEndTest.java (Selenium WebDriver + POM)</w:t>
             </w:r>
           </w:p>
         </w:tc>

</xml_diff>